<commit_message>
docs: quitar seccion Proximos pasos del reporte E3
</commit_message>
<xml_diff>
--- a/docs/Reporte_Entrega3.docx
+++ b/docs/Reporte_Entrega3.docx
@@ -1011,55 +1011,6 @@
         <w:t>SAT-Dengue demuestra que es posible construir un sistema de alerta temprana reproducible, explicable y desplegable con datos de vigilancia epidemiológica pública. Los rezagos de casos y la posición en el canal endémico son las señales predictivas dominantes. El experimento de integración climática, aunque negativo en términos de mejora de AUROC, es un resultado científicamente válido y fue documentado como tal. Los equipos de salud pública pueden usar el tablero para priorizar campañas de prevención con un horizonte de un mes, con probabilidades calibradas que facilitan la comunicación del riesgo.</w:t>
       </w:r>
     </w:p>
-    <w:p>
-      <w:pPr>
-        <w:pStyle w:val="Heading2"/>
-      </w:pPr>
-      <w:r>
-        <w:t>Próximos pasos</w:t>
-      </w:r>
-    </w:p>
-    <w:p>
-      <w:pPr>
-        <w:pStyle w:val="ListBullet"/>
-      </w:pPr>
-      <w:r>
-        <w:t>Ampliar el piloto a municipios con alta incidencia histórica (Barranquilla, Medellín, Cúcuta).</w:t>
-      </w:r>
-    </w:p>
-    <w:p>
-      <w:pPr>
-        <w:pStyle w:val="ListBullet"/>
-      </w:pPr>
-      <w:r>
-        <w:t>Automatizar la ingesta mensual de datos SIVIGILA mediante el endpoint /v2/monthly-runs.</w:t>
-      </w:r>
-    </w:p>
-    <w:p>
-      <w:pPr>
-        <w:pStyle w:val="ListBullet"/>
-      </w:pPr>
-      <w:r>
-        <w:t>Validación prospectiva con autoridades sanitarias durante 2026.</w:t>
-      </w:r>
-    </w:p>
-    <w:p>
-      <w:pPr>
-        <w:pStyle w:val="ListBullet"/>
-      </w:pPr>
-      <w:r>
-        <w:t>Explorar modelos jerárquicos que compartan información entre municipios.</w:t>
-      </w:r>
-    </w:p>
-    <w:p>
-      <w:r>
-        <w:rPr>
-          <w:i/>
-          <w:sz w:val="18"/>
-        </w:rPr>
-        <w:t>Repositorio: github.com/j-mauro-r/microproyecto-tema3  ·  MLflow: http://54.163.207.5:5000  ·  Experimento: sat-dengue</w:t>
-      </w:r>
-    </w:p>
     <w:sectPr>
       <w:pgSz w:w="12240" w:h="15840"/>
       <w:pgMar w:top="1440" w:right="1800" w:bottom="1440" w:left="1800" w:header="720" w:footer="720" w:gutter="0"/>

</xml_diff>